<commit_message>
docs: rework LR2 report and defense speech for stage I
</commit_message>
<xml_diff>
--- a/docs/Доклад_ЛР2.docx
+++ b/docs/Доклад_ЛР2.docx
@@ -41,7 +41,7 @@
         <w:rPr>
           <w:sz w:val="28"/>
         </w:rPr>
-        <w:t>Цель работы — сформировать практические навыки организации технологического процесса промышленного производства программного обеспечения. Работа включала два этапа: организацию разработки и реализацию самой информационной системы.</w:t>
+        <w:t>Цель работы — сформировать практические навыки организации технологического процесса промышленного производства программного обеспечения. В отчёте представлен этап I — организация разработки. Реализация самой информационной системы относится к следующей лабораторной работе, поэтому в отчёт и доклад не включена.</w:t>
       </w:r>
     </w:p>
     <w:p>
@@ -49,7 +49,7 @@
         <w:rPr>
           <w:sz w:val="28"/>
         </w:rPr>
-        <w:t>На первом этапе мы развернули изолированную виртуальную машину QEMU/KVM с Ubuntu 24.04, установили Redmine 6.1.5, PostgreSQL 16, nginx, Puma и Git. В Redmine создали закрытый проект pc-assembly-34, три учетные записи участников, роли, пять трекеров, семь статусов и матрицу переходов. По требованиям первой лабораторной работы построили дерево из 38 задач: два этапа, семь задач этапа I, пять групп требований и 22 задачи FR-01–FR-22. Права проверили практически: руководитель закрывает и возвращает задачи, обычный участник не получает доступ к системной административной панели.</w:t>
+        <w:t>На этапе I мы развернули изолированную виртуальную машину QEMU/KVM с Ubuntu Server 24.04, установили Redmine 6.1.5, PostgreSQL 16, nginx, Puma и Git. Развёртывание автоматизировано командами make; проверка make vm-check подтвердила доступность HTTP-страницы, ресурсов темы Bleuclair и вход администратора. Данные и настройки сохраняются между запусками.</w:t>
       </w:r>
     </w:p>
     <w:p>
@@ -57,7 +57,7 @@
         <w:rPr>
           <w:sz w:val="28"/>
         </w:rPr>
-        <w:t>На втором этапе реализовали информационную систему. Серверная часть — модульный монолит на Go с REST API и PostgreSQL, клиентская — SPA на React и TypeScript. Отдельный учебный сервис имитирует платежную и доставочную системы. Реализованы каталог, поиск, конфигуратор с проверкой совместимости, корзина, оформление заказа, оплата, склад, сборка, тестирование, доработка, доставка и уведомления.</w:t>
+        <w:t>В Redmine создали закрытый проект pc-assembly-34, три учётные записи участников и служебную запись администратора — всего четыре учётные записи. Настроили роли «Руководитель проекта», «Специалист по ИС» и «DevOps-инженер», пять трекеров, семь статусов и матрицу переходов. Права проверили практически: руководитель управляет проектом и закрывает задачи, а специалист по ИС при обращении к системной административной панели получает отказ 403.</w:t>
       </w:r>
     </w:p>
     <w:p>
@@ -65,7 +65,7 @@
         <w:rPr>
           <w:sz w:val="28"/>
         </w:rPr>
-        <w:t>Критичные операции сделаны транзакционными. Создание заказа, проверка цены и остатков, резервирование и запись истории выполняются в одной транзакции. Если хотя бы одного товара не хватает, изменения полностью откатываются. Повторное платежное событие не проводится дважды: идентификатор события является первичным ключом. Для конфигуратора реализованы проверки сокета, типа памяти, форм-фактора, габаритов видеокарты, мощности и разъемов блока питания.</w:t>
+        <w:t>По требованиям первой лабораторной работы построили дерево из 38 задач: два этапа, семь задач этапа I, пять групп требований, 22 задачи FR-01–FR-22, а также две задачи на приёмочные испытания и документацию. Задачи этапа II включены в дерево как план следующей работы, но в этой лабораторной не выполнялись. Для задач этапа I назначены исполнители и определены критерии приёмки.</w:t>
       </w:r>
     </w:p>
     <w:p>
@@ -73,7 +73,7 @@
         <w:rPr>
           <w:sz w:val="28"/>
         </w:rPr>
-        <w:t>Проверки выполнены на трех уровнях. Приемочные тесты Go с флагом -race покрывают конкурентное резервирование последней единицы товара, фиксацию цен и откат, повтор платежа, возврат после неудачной сборки и конфликт совместимости — все пять тестов пройдены. Сквозные проверки Playwright выполнены в Chromium, Firefox и WebKit: по 12 проверок в каждом браузере, всего 36, все пройдены. Отдельно проверена модель работ в Redmine: 38 задач, три участника и запрет административной панели для обычного пользователя.</w:t>
+        <w:t>В виртуальной машине установлен Git, настроен учебный пользователь, репозиторий получен с GitHub, в него добавлены README и условные исходные файлы. В истории применена модель Git Flow: ветка feature/init-skeleton влита в develop, релизная ветка release-0.1.0 отмечена тегом v0.1.0, исправление hotfix-0.1.1 — тегом v0.1.1, а ветка с инфраструктурой ВМ влита в main. Секреты, SSH-ключи и каталог .vm исключены из репозитория.</w:t>
       </w:r>
     </w:p>
     <w:p>
@@ -81,7 +81,7 @@
         <w:rPr>
           <w:sz w:val="28"/>
         </w:rPr>
-        <w:t>В Git использована модель Git Flow. В истории уже были ветки feature/init-skeleton, release-0.1.0 и hotfix-0.1.1 с тегами v0.1.0 и v0.1.1. Для этапа II создана ветка feature/app-implementation, выполнены пять осмысленных коммитов, слияние в main с флагом --no-ff и тег v0.2.0. Секреты, локальные сертификаты и артефакты сборки исключены из репозитория.</w:t>
+        <w:t>Из сложностей отмечу главную: в методических указаниях описаны VirtualBox, Windows, Astra Linux, Redmine 4.0.5 и PostgreSQL 9.6, а мы использовали QEMU/KVM, Ubuntu 24.04, Redmine 6.1.5 и PostgreSQL 16. Это обеспечило воспроизводимость в учебной среде, но отличие не было предварительно согласовано с преподавателем и зафиксировано в выводах.</w:t>
       </w:r>
     </w:p>
     <w:p>
@@ -89,15 +89,7 @@
         <w:rPr>
           <w:sz w:val="28"/>
         </w:rPr>
-        <w:t>Из сложностей отмечу три. Во-первых, в методичке описаны VirtualBox и Windows, а мы использовали QEMU/KVM и Ubuntu; это отличие не было предварительно согласовано с преподавателем. Во-вторых, платежная и доставочная системы заменены учебным симулятором, поэтому реальные банковские операции не выполняются. В-третьих, нагрузочное тестирование 100 сессий, восстановление из резервной копии и проверка HTTPS в docker-стеке не выполнялись — эти работы требуют отдельного стенда.</w:t>
-      </w:r>
-    </w:p>
-    <w:p>
-      <w:r>
-        <w:rPr>
-          <w:sz w:val="28"/>
-        </w:rPr>
-        <w:t>Главный результат: создана работающая среда, построена и проверена модель работ, реализована информационная система с транзакционным заказом, оплатой, складом, сборкой и доставкой, подготовлены отчет на 42 страницы, схемы, скриншоты и автоматические проверки. Считаю, что цель лабораторной работы достигнута. Спасибо за внимание, готов ответить на вопросы.</w:t>
+        <w:t>Главный результат: создана работающая и воспроизводимая среда, настроены Redmine, роли, права, трекеры, статусы и переходы, построено и проверено дерево из 38 задач, продемонстрирована модель Git Flow. Подготовлены отчёт на 28 страниц со снимками экрана, таблицами и списком источников, а также настоящий доклад. Считаю, что цель этапа I достигнута. Спасибо за внимание, готов ответить на вопросы.</w:t>
       </w:r>
     </w:p>
     <w:p>
@@ -173,7 +165,28 @@
         <w:rPr>
           <w:sz w:val="28"/>
         </w:rPr>
-        <w:t>В проекте Redmine три роли. Руководитель проекта управляет проектом, участниками, версиями, категориями и связями задач, закрывает, возвращает и отменяет задачи. Специалист по ИС и DevOps-инженер имеют базовые права на задачи, wiki, файлы и репозиторий, а также управляют подзадачами. В приложении ролевая модель шире: покупатель видит свои заказы и оформляет их; менеджер управляет каталогом и заказами; склад комплектует и ведет остатки; сборщик выполняет сборку и тест; администратор управляет учетными записями и ролями. Сервер повторно проверяет роль в каждом защищенном методе.</w:t>
+        <w:t>В проекте Redmine три роли. Руководитель проекта управляет проектом, участниками, версиями, категориями и связями задач, закрывает, возвращает и отменяет задачи. Специалист по ИС и DevOps-инженер имеют базовые права на задачи, wiki, файлы и репозиторий, а также управляют подзадачами. Встроенные роли «Менеджер», «Разработчик» и «Репортер» в проекте не назначены. Служебная учётная запись администратора используется только для настройки Redmine.</w:t>
+      </w:r>
+    </w:p>
+    <w:p>
+      <w:pPr>
+        <w:spacing w:before="120"/>
+        <w:ind w:firstLine="0"/>
+      </w:pPr>
+      <w:r>
+        <w:rPr>
+          <w:b/>
+          <w:sz w:val="28"/>
+        </w:rPr>
+        <w:t>4. Почему в отчёте рассматривается только этап I?</w:t>
+      </w:r>
+    </w:p>
+    <w:p>
+      <w:r>
+        <w:rPr>
+          <w:sz w:val="28"/>
+        </w:rPr>
+        <w:t>В методических указаниях задание сформулировано для двух этапов, но в настоящей работе выполнен этап I — организация технологического процесса. Реализация информационной системы относится к следующей лабораторной работе; задачи этапа II включены в дерево работ как план, но в отчёте не заявляются как выполненные.</w:t>
       </w:r>
     </w:p>
     <w:p>
@@ -325,11 +338,11 @@
         <w:rPr>
           <w:sz w:val="28"/>
         </w:rPr>
-        <w:t>Git Flow использует main для стабильных релизов и develop для интеграции. Функциональные ветки feature/* создаются от develop и вливаются обратно. Релизная ветка release/* стабилизирует версию и вливается в main и develop; hotfix/* создается от main для срочного исправления и вливается в main и develop. Релизы отмечаются тегами. В нашем репозитории эта модель применена для версий v0.1.0 и v0.1.1, а этап II интегрирован через feature/app-implementation с тегом v0.2.0.</w:t>
+        <w:t>Git Flow использует main для стабильных релизов и develop для интеграции. Функциональные ветки feature/* создаются от develop и вливаются обратно. Релизная ветка release/* стабилизирует версию и вливается в main и develop; hotfix/* создается от main для срочного исправления и вливается в main и develop. Релизы отмечаются тегами. В нашем репозитории эта модель применена для версий v0.1.0 и v0.1.1; ветка с инфраструктурой виртуальной машины влита в main.</w:t>
       </w:r>
     </w:p>
     <w:sectPr>
-      <w:pgSz w:w="12240" w:h="15840"/>
+      <w:pgSz w:w="11906" w:h="16838"/>
       <w:pgMar w:top="1134" w:right="850" w:bottom="1134" w:left="1701" w:header="720" w:footer="720" w:gutter="0"/>
       <w:cols w:space="720"/>
       <w:docGrid w:linePitch="360"/>

</xml_diff>